<commit_message>
Update report GitHub link
</commit_message>
<xml_diff>
--- a/docs/rapor.docx
+++ b/docs/rapor.docx
@@ -86,17 +86,7 @@
     </w:p>
     <w:p>
       <w:r>
-        <w:t xml:space="preserve">GitHub public repo linki: `https://github.com/kullanici/plaka-tespit-okuma`</w:t>
-      </w:r>
-    </w:p>
-    <w:p>
-      <w:r>
-        <w:t xml:space="preserve"/>
-      </w:r>
-    </w:p>
-    <w:p>
-      <w:r>
-        <w:t xml:space="preserve">Not: Bu link teslimden önce gerçek public GitHub repo linkiyle değiştirilecektir.</w:t>
+        <w:t xml:space="preserve">GitHub public repo linki: `https://github.com/mhmtmndrn/Derin-Ogrenme-Tabanli-Arac-Plaka-Tespit-Ve-Tanima-Sistemi`</w:t>
       </w:r>
     </w:p>
     <w:p>

</xml_diff>

<commit_message>
Align report with assignment requirements
</commit_message>
<xml_diff>
--- a/docs/rapor.docx
+++ b/docs/rapor.docx
@@ -16,6 +16,16 @@
       </w:r>
     </w:p>
     <w:p>
+      <w:r>
+        <w:t xml:space="preserve">Bu rapor, Python Programlamaya Giriş dersi kapsamında verilen ödevde istenen başlıklara göre hazırlanmıştır. Çalışmada proje adı, konu, public GitHub bağlantısı, yöntem, algoritma akış şeması, uygulama tasarımı, başarı ölçütleri, teknik prototip, örnek senaryo, somut çıktılar ve APA biçiminde kaynakça yer almaktadır.</w:t>
+      </w:r>
+    </w:p>
+    <w:p>
+      <w:r>
+        <w:t xml:space="preserve"/>
+      </w:r>
+    </w:p>
+    <w:p>
       <w:pPr>
         <w:pStyle w:val="Heading1"/>
       </w:pPr>
@@ -128,6 +138,56 @@
       </w:r>
     </w:p>
     <w:p>
+      <w:r>
+        <w:t xml:space="preserve">Projenin çalışma adımları şu şekildedir:</w:t>
+      </w:r>
+    </w:p>
+    <w:p>
+      <w:r>
+        <w:t xml:space="preserve"/>
+      </w:r>
+    </w:p>
+    <w:p>
+      <w:r>
+        <w:t xml:space="preserve">1. Araç fotoğrafı programa verilir.</w:t>
+      </w:r>
+    </w:p>
+    <w:p>
+      <w:r>
+        <w:t xml:space="preserve">2. Eğitilmiş YOLO11n modeli yüklenir.</w:t>
+      </w:r>
+    </w:p>
+    <w:p>
+      <w:r>
+        <w:t xml:space="preserve">3. Görsel üzerindeki plaka bölgesi nesne tespitiyle bulunur.</w:t>
+      </w:r>
+    </w:p>
+    <w:p>
+      <w:r>
+        <w:t xml:space="preserve">4. En güvenilir plaka kutusu seçilir ve plaka alanı kırpılır.</w:t>
+      </w:r>
+    </w:p>
+    <w:p>
+      <w:r>
+        <w:t xml:space="preserve">5. Kırpılan görüntü OCR için ön işlemden geçirilir.</w:t>
+      </w:r>
+    </w:p>
+    <w:p>
+      <w:r>
+        <w:t xml:space="preserve">6. EasyOCR ile plaka karakterleri okunur.</w:t>
+      </w:r>
+    </w:p>
+    <w:p>
+      <w:r>
+        <w:t xml:space="preserve">7. Metin temizlenir, güven skorları hesaplanır ve sonuçlar görsel/CSV olarak kaydedilir.</w:t>
+      </w:r>
+    </w:p>
+    <w:p>
+      <w:r>
+        <w:t xml:space="preserve"/>
+      </w:r>
+    </w:p>
+    <w:p>
       <w:pPr>
         <w:pStyle w:val="Heading1"/>
       </w:pPr>
@@ -282,6 +342,41 @@
       </w:r>
     </w:p>
     <w:p>
+      <w:r>
+        <w:t xml:space="preserve">Algoritma açıklaması ödevde istenen dört temel parçaya göre aşağıdaki gibidir:</w:t>
+      </w:r>
+    </w:p>
+    <w:p>
+      <w:r>
+        <w:t xml:space="preserve"/>
+      </w:r>
+    </w:p>
+    <w:p>
+      <w:r>
+        <w:t xml:space="preserve">• Girdi: Kullanıcının verdiği araç fotoğrafı ve eğitilmiş YOLO ağırlık dosyasıdır.</w:t>
+      </w:r>
+    </w:p>
+    <w:p>
+      <w:r>
+        <w:t xml:space="preserve">• İşlem: Fotoğraf okunur, YOLO modeliyle plaka kutusu tahmin edilir ve plaka bölgesi kırpılır.</w:t>
+      </w:r>
+    </w:p>
+    <w:p>
+      <w:r>
+        <w:t xml:space="preserve">• Hesaplama: Plaka kutusu güven skoru, OCR sonucu ve OCR güven skoru hesaplanır; okunan metin harf/rakam dışı karakterlerden temizlenir.</w:t>
+      </w:r>
+    </w:p>
+    <w:p>
+      <w:r>
+        <w:t xml:space="preserve">• Çıktı: İşaretlenmiş sonuç görseli, kırpılmış plaka görüntüsü ve plaka metni/güven skorlarını içeren CSV dosyası üretilir.</w:t>
+      </w:r>
+    </w:p>
+    <w:p>
+      <w:r>
+        <w:t xml:space="preserve"/>
+      </w:r>
+    </w:p>
+    <w:p>
       <w:pPr>
         <w:pStyle w:val="Heading1"/>
       </w:pPr>
@@ -329,6 +424,81 @@
     </w:p>
     <w:p>
       <w:r>
+        <w:t xml:space="preserve">Kullanıcının gireceği bilgiler:</w:t>
+      </w:r>
+    </w:p>
+    <w:p>
+      <w:r>
+        <w:t xml:space="preserve"/>
+      </w:r>
+    </w:p>
+    <w:p>
+      <w:r>
+        <w:t xml:space="preserve">• `--image`: İşlenecek araç fotoğrafının yolu</w:t>
+      </w:r>
+    </w:p>
+    <w:p>
+      <w:r>
+        <w:t xml:space="preserve">• `--weights`: Eğitilmiş YOLO model dosyasının yolu</w:t>
+      </w:r>
+    </w:p>
+    <w:p>
+      <w:r>
+        <w:t xml:space="preserve">• `--output`: İşaretlenmiş sonuç görselinin kaydedileceği yol</w:t>
+      </w:r>
+    </w:p>
+    <w:p>
+      <w:r>
+        <w:t xml:space="preserve">• `--csv`: Sonuç tablosunun kaydedileceği yol</w:t>
+      </w:r>
+    </w:p>
+    <w:p>
+      <w:r>
+        <w:t xml:space="preserve"/>
+      </w:r>
+    </w:p>
+    <w:p>
+      <w:r>
+        <w:t xml:space="preserve">Programın hesapladığı değerler:</w:t>
+      </w:r>
+    </w:p>
+    <w:p>
+      <w:r>
+        <w:t xml:space="preserve"/>
+      </w:r>
+    </w:p>
+    <w:p>
+      <w:r>
+        <w:t xml:space="preserve">• Plaka konumunu belirleyen koordinatlar</w:t>
+      </w:r>
+    </w:p>
+    <w:p>
+      <w:r>
+        <w:t xml:space="preserve">• YOLO tespit güven skoru</w:t>
+      </w:r>
+    </w:p>
+    <w:p>
+      <w:r>
+        <w:t xml:space="preserve">• OCR ile okunan ham ve temizlenmiş plaka metni</w:t>
+      </w:r>
+    </w:p>
+    <w:p>
+      <w:r>
+        <w:t xml:space="preserve">• OCR güven skoru</w:t>
+      </w:r>
+    </w:p>
+    <w:p>
+      <w:r>
+        <w:t xml:space="preserve">• Sonuç durumu: başarılı, düşük güven veya tespit edilemedi</w:t>
+      </w:r>
+    </w:p>
+    <w:p>
+      <w:r>
+        <w:t xml:space="preserve"/>
+      </w:r>
+    </w:p>
+    <w:p>
+      <w:r>
         <w:t xml:space="preserve">Programın ürettiği çıktılar:</w:t>
       </w:r>
     </w:p>
@@ -435,7 +605,17 @@
     </w:p>
     <w:p>
       <w:r>
-        <w:t xml:space="preserve">Program modüler dosyalardan oluşur:</w:t>
+        <w:t xml:space="preserve">Programın ana akışı `src/main.py` dosyasında kurulmuştur. Ana akışta komut satırı argümanları okunur, görsel dosyası kontrol edilir, YOLO modeliyle tespit yapılır, plaka kırpılır, OCR uygulanır ve sonuçlar kaydedilir. Böylece ödevde istenen en az bir işlem hattı baştan sona çalıştırılmıştır.</w:t>
+      </w:r>
+    </w:p>
+    <w:p>
+      <w:r>
+        <w:t xml:space="preserve"/>
+      </w:r>
+    </w:p>
+    <w:p>
+      <w:r>
+        <w:t xml:space="preserve">Fonksiyonlar modüler hale getirilmiştir:</w:t>
       </w:r>
     </w:p>
     <w:p>
@@ -484,6 +664,16 @@
       </w:r>
     </w:p>
     <w:p>
+      <w:r>
+        <w:t xml:space="preserve">Grafik, tablo ve ara çıktılar da üretilmiştir. Eğitim sürecinden `results.csv`, `results.png`, `confusion_matrix.png`, `BoxPR_curve.png` ve örnek tahmin görseli alınmıştır. Prototip çalıştırıldığında ayrıca `outputs/results.csv`, `outputs/demo_result.jpg` ve kırpılmış plaka görüntüsü oluşturulmuştur.</w:t>
+      </w:r>
+    </w:p>
+    <w:p>
+      <w:r>
+        <w:t xml:space="preserve"/>
+      </w:r>
+    </w:p>
+    <w:p>
       <w:pPr>
         <w:pStyle w:val="Heading1"/>
       </w:pPr>
@@ -724,7 +914,70 @@
         <w:pStyle w:val="Heading1"/>
       </w:pPr>
       <w:r>
-        <w:t xml:space="preserve">11. Kaynakça</w:t>
+        <w:t xml:space="preserve">11. Teslim Edilmesi Gereken Somut Çıktılar</w:t>
+      </w:r>
+    </w:p>
+    <w:p>
+      <w:r>
+        <w:t xml:space="preserve"/>
+      </w:r>
+    </w:p>
+    <w:p>
+      <w:r>
+        <w:t xml:space="preserve">Ödev dosyasında istenen somut çıktılar bu projede aşağıdaki şekilde karşılanmıştır:</w:t>
+      </w:r>
+    </w:p>
+    <w:p>
+      <w:r>
+        <w:t xml:space="preserve"/>
+      </w:r>
+    </w:p>
+    <w:p>
+      <w:r>
+        <w:t xml:space="preserve">• Akış şeması: `docs/akis_semasi.mmd` ve rapordaki mermaid akış şeması</w:t>
+      </w:r>
+    </w:p>
+    <w:p>
+      <w:r>
+        <w:t xml:space="preserve">• Algoritma açıklaması: raporun yöntem ve algoritma akış şeması bölümleri</w:t>
+      </w:r>
+    </w:p>
+    <w:p>
+      <w:r>
+        <w:t xml:space="preserve">• Çalışan ilk prototip kod: `src/main.py` ve modüler `src/` dosyaları</w:t>
+      </w:r>
+    </w:p>
+    <w:p>
+      <w:r>
+        <w:t xml:space="preserve">• Baştan sona denenmiş örnek senaryo: `samples/ornek_arac.jpg` ile yapılan demo</w:t>
+      </w:r>
+    </w:p>
+    <w:p>
+      <w:r>
+        <w:t xml:space="preserve">• Tablo/grafik/ara çıktı: `outputs/results.csv`, `docs/egitim_ciktilari/results.png`, `docs/egitim_ciktilari/confusion_matrix.png`</w:t>
+      </w:r>
+    </w:p>
+    <w:p>
+      <w:r>
+        <w:t xml:space="preserve">• Model çıktısı: `models/best.pt`</w:t>
+      </w:r>
+    </w:p>
+    <w:p>
+      <w:r>
+        <w:t xml:space="preserve">• Kaynakça ve literatür kullanımı: raporda YOLO, ALPR, YOLO11, Roboflow ve EasyOCR kaynaklarına APA biçiminde yer verilmiş; ilgili bölümlerde metin içi atıf yapılmıştır.</w:t>
+      </w:r>
+    </w:p>
+    <w:p>
+      <w:r>
+        <w:t xml:space="preserve"/>
+      </w:r>
+    </w:p>
+    <w:p>
+      <w:pPr>
+        <w:pStyle w:val="Heading1"/>
+      </w:pPr>
+      <w:r>
+        <w:t xml:space="preserve">12. Kaynakça</w:t>
       </w:r>
     </w:p>
     <w:p>

</xml_diff>

<commit_message>
Add assignment-ready report PDF
</commit_message>
<xml_diff>
--- a/docs/rapor.docx
+++ b/docs/rapor.docx
@@ -193,6 +193,26 @@
       </w:pPr>
       <w:r>
         <w:t xml:space="preserve">5. Algoritma Akış Şeması</w:t>
+      </w:r>
+    </w:p>
+    <w:p>
+      <w:r>
+        <w:t xml:space="preserve"/>
+      </w:r>
+    </w:p>
+    <w:p>
+      <w:r>
+        <w:t xml:space="preserve">Metinsel akış şeması özeti:</w:t>
+      </w:r>
+    </w:p>
+    <w:p>
+      <w:r>
+        <w:t xml:space="preserve"/>
+      </w:r>
+    </w:p>
+    <w:p>
+      <w:r>
+        <w:t xml:space="preserve">`Araç fotoğrafı -&gt; Görsel kontrolü -&gt; YOLO11n ile plaka tespiti -&gt; Plaka kırpma -&gt; Görüntü ön işleme -&gt; EasyOCR ile okuma -&gt; Metin temizleme ve güven skoru -&gt; Görsel/CSV çıktı`</w:t>
       </w:r>
     </w:p>
     <w:p>

</xml_diff>

<commit_message>
Add visual algorithm flowchart to report
</commit_message>
<xml_diff>
--- a/docs/rapor.docx
+++ b/docs/rapor.docx
@@ -1,6 +1,6 @@
 
 <file path=word/document.xml><?xml version="1.0" encoding="utf-8"?>
-<w:document xmlns:w="http://schemas.openxmlformats.org/wordprocessingml/2006/main">
+<w:document xmlns:w="http://schemas.openxmlformats.org/wordprocessingml/2006/main" xmlns:r="http://schemas.openxmlformats.org/officeDocument/2006/relationships" xmlns:wp="http://schemas.openxmlformats.org/drawingml/2006/wordprocessingDrawing" xmlns:a="http://schemas.openxmlformats.org/drawingml/2006/main" xmlns:pic="http://schemas.openxmlformats.org/drawingml/2006/picture">
   <w:body>
     <w:p>
       <w:pPr>
@@ -201,18 +201,112 @@
       </w:r>
     </w:p>
     <w:p>
-      <w:r>
-        <w:t xml:space="preserve">Metinsel akış şeması özeti:</w:t>
-      </w:r>
-    </w:p>
-    <w:p>
-      <w:r>
-        <w:t xml:space="preserve"/>
-      </w:r>
-    </w:p>
-    <w:p>
-      <w:r>
-        <w:t xml:space="preserve">`Araç fotoğrafı -&gt; Görsel kontrolü -&gt; YOLO11n ile plaka tespiti -&gt; Plaka kırpma -&gt; Görüntü ön işleme -&gt; EasyOCR ile okuma -&gt; Metin temizleme ve güven skoru -&gt; Görsel/CSV çıktı`</w:t>
+      <w:pPr>
+        <w:jc w:val="center"/>
+      </w:pPr>
+      <w:r>
+        <w:drawing>
+          <wp:inline distT="0" distB="0" distL="0" distR="0">
+            <wp:extent cx="5760000" cy="6171430"/>
+            <wp:docPr id="101" name="Algoritma Akış Şeması"/>
+            <wp:cNvGraphicFramePr>
+              <a:graphicFrameLocks noChangeAspect="1"/>
+            </wp:cNvGraphicFramePr>
+            <a:graphic>
+              <a:graphicData uri="http://schemas.openxmlformats.org/drawingml/2006/picture">
+                <pic:pic>
+                  <pic:nvPicPr>
+                    <pic:cNvPr id="201" name="Algoritma Akış Şeması"/>
+                    <pic:cNvPicPr/>
+                  </pic:nvPicPr>
+                  <pic:blipFill>
+                    <a:blip r:embed="rIdImage1"/>
+                    <a:stretch>
+                      <a:fillRect/>
+                    </a:stretch>
+                  </pic:blipFill>
+                  <pic:spPr>
+                    <a:xfrm>
+                      <a:off x="0" y="0"/>
+                      <a:ext cx="5760000" cy="6171430"/>
+                    </a:xfrm>
+                    <a:prstGeom prst="rect">
+                      <a:avLst/>
+                    </a:prstGeom>
+                  </pic:spPr>
+                </pic:pic>
+              </a:graphicData>
+            </a:graphic>
+          </wp:inline>
+        </w:drawing>
+      </w:r>
+    </w:p>
+    <w:p>
+      <w:r>
+        <w:t xml:space="preserve"/>
+      </w:r>
+    </w:p>
+    <w:p>
+      <w:r>
+        <w:t xml:space="preserve">Algoritma açıklaması ödevde istenen dört temel parçaya göre aşağıdaki gibidir:</w:t>
+      </w:r>
+    </w:p>
+    <w:p>
+      <w:r>
+        <w:t xml:space="preserve"/>
+      </w:r>
+    </w:p>
+    <w:p>
+      <w:r>
+        <w:t xml:space="preserve">• Girdi: Kullanıcının verdiği araç fotoğrafı ve eğitilmiş YOLO ağırlık dosyasıdır.</w:t>
+      </w:r>
+    </w:p>
+    <w:p>
+      <w:r>
+        <w:t xml:space="preserve">• İşlem: Fotoğraf okunur, YOLO modeliyle plaka kutusu tahmin edilir ve plaka bölgesi kırpılır.</w:t>
+      </w:r>
+    </w:p>
+    <w:p>
+      <w:r>
+        <w:t xml:space="preserve">• Hesaplama: Plaka kutusu güven skoru, OCR sonucu ve OCR güven skoru hesaplanır; okunan metin harf/rakam dışı karakterlerden temizlenir.</w:t>
+      </w:r>
+    </w:p>
+    <w:p>
+      <w:r>
+        <w:t xml:space="preserve">• Çıktı: İşaretlenmiş sonuç görseli, kırpılmış plaka görüntüsü ve plaka metni/güven skorlarını içeren CSV dosyası üretilir.</w:t>
+      </w:r>
+    </w:p>
+    <w:p>
+      <w:r>
+        <w:t xml:space="preserve"/>
+      </w:r>
+    </w:p>
+    <w:p>
+      <w:pPr>
+        <w:pStyle w:val="Heading1"/>
+      </w:pPr>
+      <w:r>
+        <w:t xml:space="preserve">6. Uygulama Tasarımı</w:t>
+      </w:r>
+    </w:p>
+    <w:p>
+      <w:r>
+        <w:t xml:space="preserve"/>
+      </w:r>
+    </w:p>
+    <w:p>
+      <w:r>
+        <w:t xml:space="preserve">Kullanıcı programa bir araç fotoğrafı ve eğitilmiş YOLO ağırlık dosyası verir. Program fotoğrafı okur, plaka bölgesini tespit eder, plakayı kırpar ve OCR işlemini uygular.</w:t>
+      </w:r>
+    </w:p>
+    <w:p>
+      <w:r>
+        <w:t xml:space="preserve"/>
+      </w:r>
+    </w:p>
+    <w:p>
+      <w:r>
+        <w:t xml:space="preserve">Örnek komut:</w:t>
       </w:r>
     </w:p>
     <w:p>
@@ -225,215 +319,6 @@
         <w:pStyle w:val="Code"/>
       </w:pPr>
       <w:r>
-        <w:t xml:space="preserve">flowchart TD</w:t>
-      </w:r>
-    </w:p>
-    <w:p>
-      <w:pPr>
-        <w:pStyle w:val="Code"/>
-      </w:pPr>
-      <w:r>
-        <w:t xml:space="preserve">    A["Girdi: Araç fotoğrafı"] --&gt; B{"Görsel dosyası okunabiliyor mu?"}</w:t>
-      </w:r>
-    </w:p>
-    <w:p>
-      <w:pPr>
-        <w:pStyle w:val="Code"/>
-      </w:pPr>
-      <w:r>
-        <w:t xml:space="preserve">    B -- "Hayır" --&gt; C["Hata mesajı: görsel bulunamadı veya okunamadı"]</w:t>
-      </w:r>
-    </w:p>
-    <w:p>
-      <w:pPr>
-        <w:pStyle w:val="Code"/>
-      </w:pPr>
-      <w:r>
-        <w:t xml:space="preserve">    B -- "Evet" --&gt; D["YOLO11 plaka tespit modeli yüklenir"]</w:t>
-      </w:r>
-    </w:p>
-    <w:p>
-      <w:pPr>
-        <w:pStyle w:val="Code"/>
-      </w:pPr>
-      <w:r>
-        <w:t xml:space="preserve">    D --&gt; E["Görselde plaka kutusu tahmin edilir"]</w:t>
-      </w:r>
-    </w:p>
-    <w:p>
-      <w:pPr>
-        <w:pStyle w:val="Code"/>
-      </w:pPr>
-      <w:r>
-        <w:t xml:space="preserve">    E --&gt; F{"Plaka tespit edildi mi?"}</w:t>
-      </w:r>
-    </w:p>
-    <w:p>
-      <w:pPr>
-        <w:pStyle w:val="Code"/>
-      </w:pPr>
-      <w:r>
-        <w:t xml:space="preserve">    F -- "Hayır" --&gt; G["Çıktı görseline tespit edilemedi notu yazılır"]</w:t>
-      </w:r>
-    </w:p>
-    <w:p>
-      <w:pPr>
-        <w:pStyle w:val="Code"/>
-      </w:pPr>
-      <w:r>
-        <w:t xml:space="preserve">    F -- "Evet" --&gt; H["En yüksek güvenli plaka bölgesi kırpılır"]</w:t>
-      </w:r>
-    </w:p>
-    <w:p>
-      <w:pPr>
-        <w:pStyle w:val="Code"/>
-      </w:pPr>
-      <w:r>
-        <w:t xml:space="preserve">    H --&gt; I["Ön işleme: gri ton, kontrast artırma, eşikleme"]</w:t>
-      </w:r>
-    </w:p>
-    <w:p>
-      <w:pPr>
-        <w:pStyle w:val="Code"/>
-      </w:pPr>
-      <w:r>
-        <w:t xml:space="preserve">    I --&gt; J["EasyOCR ile plaka karakterleri okunur"]</w:t>
-      </w:r>
-    </w:p>
-    <w:p>
-      <w:pPr>
-        <w:pStyle w:val="Code"/>
-      </w:pPr>
-      <w:r>
-        <w:t xml:space="preserve">    J --&gt; K["Metin temizlenir ve güven skoru hesaplanır"]</w:t>
-      </w:r>
-    </w:p>
-    <w:p>
-      <w:pPr>
-        <w:pStyle w:val="Code"/>
-      </w:pPr>
-      <w:r>
-        <w:t xml:space="preserve">    K --&gt; L{"OCR güveni yeterli mi?"}</w:t>
-      </w:r>
-    </w:p>
-    <w:p>
-      <w:pPr>
-        <w:pStyle w:val="Code"/>
-      </w:pPr>
-      <w:r>
-        <w:t xml:space="preserve">    L -- "Hayır" --&gt; M["Sonuç düşük güven olarak işaretlenir"]</w:t>
-      </w:r>
-    </w:p>
-    <w:p>
-      <w:pPr>
-        <w:pStyle w:val="Code"/>
-      </w:pPr>
-      <w:r>
-        <w:t xml:space="preserve">    L -- "Evet" --&gt; N["Sonuç başarılı olarak işaretlenir"]</w:t>
-      </w:r>
-    </w:p>
-    <w:p>
-      <w:pPr>
-        <w:pStyle w:val="Code"/>
-      </w:pPr>
-      <w:r>
-        <w:t xml:space="preserve">    M --&gt; O["İşaretlenmiş görsel, kırpım ve CSV kaydedilir"]</w:t>
-      </w:r>
-    </w:p>
-    <w:p>
-      <w:pPr>
-        <w:pStyle w:val="Code"/>
-      </w:pPr>
-      <w:r>
-        <w:t xml:space="preserve">    N --&gt; O</w:t>
-      </w:r>
-    </w:p>
-    <w:p>
-      <w:pPr>
-        <w:pStyle w:val="Code"/>
-      </w:pPr>
-      <w:r>
-        <w:t xml:space="preserve">    G --&gt; O</w:t>
-      </w:r>
-    </w:p>
-    <w:p>
-      <w:r>
-        <w:t xml:space="preserve"/>
-      </w:r>
-    </w:p>
-    <w:p>
-      <w:r>
-        <w:t xml:space="preserve">Algoritma açıklaması ödevde istenen dört temel parçaya göre aşağıdaki gibidir:</w:t>
-      </w:r>
-    </w:p>
-    <w:p>
-      <w:r>
-        <w:t xml:space="preserve"/>
-      </w:r>
-    </w:p>
-    <w:p>
-      <w:r>
-        <w:t xml:space="preserve">• Girdi: Kullanıcının verdiği araç fotoğrafı ve eğitilmiş YOLO ağırlık dosyasıdır.</w:t>
-      </w:r>
-    </w:p>
-    <w:p>
-      <w:r>
-        <w:t xml:space="preserve">• İşlem: Fotoğraf okunur, YOLO modeliyle plaka kutusu tahmin edilir ve plaka bölgesi kırpılır.</w:t>
-      </w:r>
-    </w:p>
-    <w:p>
-      <w:r>
-        <w:t xml:space="preserve">• Hesaplama: Plaka kutusu güven skoru, OCR sonucu ve OCR güven skoru hesaplanır; okunan metin harf/rakam dışı karakterlerden temizlenir.</w:t>
-      </w:r>
-    </w:p>
-    <w:p>
-      <w:r>
-        <w:t xml:space="preserve">• Çıktı: İşaretlenmiş sonuç görseli, kırpılmış plaka görüntüsü ve plaka metni/güven skorlarını içeren CSV dosyası üretilir.</w:t>
-      </w:r>
-    </w:p>
-    <w:p>
-      <w:r>
-        <w:t xml:space="preserve"/>
-      </w:r>
-    </w:p>
-    <w:p>
-      <w:pPr>
-        <w:pStyle w:val="Heading1"/>
-      </w:pPr>
-      <w:r>
-        <w:t xml:space="preserve">6. Uygulama Tasarımı</w:t>
-      </w:r>
-    </w:p>
-    <w:p>
-      <w:r>
-        <w:t xml:space="preserve"/>
-      </w:r>
-    </w:p>
-    <w:p>
-      <w:r>
-        <w:t xml:space="preserve">Kullanıcı programa bir araç fotoğrafı ve eğitilmiş YOLO ağırlık dosyası verir. Program fotoğrafı okur, plaka bölgesini tespit eder, plakayı kırpar ve OCR işlemini uygular.</w:t>
-      </w:r>
-    </w:p>
-    <w:p>
-      <w:r>
-        <w:t xml:space="preserve"/>
-      </w:r>
-    </w:p>
-    <w:p>
-      <w:r>
-        <w:t xml:space="preserve">Örnek komut:</w:t>
-      </w:r>
-    </w:p>
-    <w:p>
-      <w:r>
-        <w:t xml:space="preserve"/>
-      </w:r>
-    </w:p>
-    <w:p>
-      <w:pPr>
-        <w:pStyle w:val="Code"/>
-      </w:pPr>
-      <w:r>
         <w:t xml:space="preserve">python src/main.py --image samples/ornek_arac.jpg --weights models/best.pt --output outputs/demo_result.jpg --csv outputs/results.csv</w:t>
       </w:r>
     </w:p>
@@ -954,7 +839,7 @@
     </w:p>
     <w:p>
       <w:r>
-        <w:t xml:space="preserve">• Akış şeması: `docs/akis_semasi.mmd` ve rapordaki mermaid akış şeması</w:t>
+        <w:t xml:space="preserve">• Akış şeması: `docs/akis_semasi.svg`, `docs/akis_semasi.png` ve rapordaki görsel akış şeması</w:t>
       </w:r>
     </w:p>
     <w:p>

</xml_diff>